<commit_message>
Update Supplementary_Materials.docx with duplicateCorrelation
</commit_message>
<xml_diff>
--- a/Supplementary_Materials.docx
+++ b/Supplementary_Materials.docx
@@ -1669,7 +1669,7 @@
         <w:pStyle w:val="FirstParagraph"/>
       </w:pPr>
       <w:r>
-        <w:t xml:space="preserve">All 17 significant genes (Benjamini–Hochberg adjusted P &lt; 0.05) from the tissue contrast using limma-voom with model</w:t>
+        <w:t xml:space="preserve">All 11 significant genes (Benjamini–Hochberg adjusted P &lt; 0.05) from the tissue contrast using limma-voom with model</w:t>
       </w:r>
       <w:r>
         <w:t xml:space="preserve"> </w:t>
@@ -1681,1650 +1681,92 @@
         <w:t xml:space="preserve">~ Tissue + State + Dataset</w:t>
       </w:r>
       <w:r>
+        <w:t xml:space="preserve"> </w:t>
+      </w:r>
+      <w:r>
+        <w:t xml:space="preserve">and</w:t>
+      </w:r>
+      <w:r>
+        <w:t xml:space="preserve"> </w:t>
+      </w:r>
+      <w:r>
+        <w:rPr>
+          <w:rStyle w:val="VerbatimChar"/>
+        </w:rPr>
+        <w:t xml:space="preserve">duplicateCorrelation(block=Donor)</w:t>
+      </w:r>
+      <w:r>
         <w:t xml:space="preserve">.</w:t>
       </w:r>
     </w:p>
-    <w:tbl>
-      <w:tblPr>
-        <w:tblStyle w:val="Table"/>
-        <w:tblW w:type="pct" w:w="5000"/>
-        <w:tblLayout w:type="fixed"/>
-        <w:tblLook w:firstRow="1" w:lastRow="0" w:firstColumn="0" w:lastColumn="0" w:noHBand="0" w:noVBand="0" w:val="0020"/>
-      </w:tblPr>
-      <w:tblGrid>
-        <w:gridCol w:w="559"/>
-        <w:gridCol w:w="559"/>
-        <w:gridCol w:w="745"/>
-        <w:gridCol w:w="1863"/>
-        <w:gridCol w:w="1211"/>
-        <w:gridCol w:w="838"/>
-        <w:gridCol w:w="1211"/>
-        <w:gridCol w:w="931"/>
-      </w:tblGrid>
-      <w:tr>
-        <w:trPr>
-          <w:tblHeader w:val="on"/>
-        </w:trPr>
-        <w:tc>
-          <w:tcPr/>
-          <w:p>
-            <w:pPr>
-              <w:pStyle w:val="Compact"/>
-            </w:pPr>
-            <w:r>
-              <w:t xml:space="preserve">Rank</w:t>
-            </w:r>
-          </w:p>
-        </w:tc>
-        <w:tc>
-          <w:tcPr/>
-          <w:p>
-            <w:pPr>
-              <w:pStyle w:val="Compact"/>
-            </w:pPr>
-            <w:r>
-              <w:t xml:space="preserve">Gene</w:t>
-            </w:r>
-          </w:p>
-        </w:tc>
-        <w:tc>
-          <w:tcPr/>
-          <w:p>
-            <w:pPr>
-              <w:pStyle w:val="Compact"/>
-            </w:pPr>
-            <w:r>
-              <w:t xml:space="preserve">log₂FC</w:t>
-            </w:r>
-          </w:p>
-        </w:tc>
-        <w:tc>
-          <w:tcPr/>
-          <w:p>
-            <w:pPr>
-              <w:pStyle w:val="Compact"/>
-            </w:pPr>
-            <w:r>
-              <w:t xml:space="preserve">Average Expression</w:t>
-            </w:r>
-          </w:p>
-        </w:tc>
-        <w:tc>
-          <w:tcPr/>
-          <w:p>
-            <w:pPr>
-              <w:pStyle w:val="Compact"/>
-            </w:pPr>
-            <w:r>
-              <w:t xml:space="preserve">t-statistic</w:t>
-            </w:r>
-          </w:p>
-        </w:tc>
-        <w:tc>
-          <w:tcPr/>
-          <w:p>
-            <w:pPr>
-              <w:pStyle w:val="Compact"/>
-            </w:pPr>
-            <w:r>
-              <w:t xml:space="preserve">P-value</w:t>
-            </w:r>
-          </w:p>
-        </w:tc>
-        <w:tc>
-          <w:tcPr/>
-          <w:p>
-            <w:pPr>
-              <w:pStyle w:val="Compact"/>
-            </w:pPr>
-            <w:r>
-              <w:t xml:space="preserve">adj. P-value</w:t>
-            </w:r>
-          </w:p>
-        </w:tc>
-        <w:tc>
-          <w:tcPr/>
-          <w:p>
-            <w:pPr>
-              <w:pStyle w:val="Compact"/>
-            </w:pPr>
-            <w:r>
-              <w:t xml:space="preserve">Category</w:t>
-            </w:r>
-          </w:p>
-        </w:tc>
-      </w:tr>
-      <w:tr>
-        <w:tc>
-          <w:tcPr/>
-          <w:p>
-            <w:pPr>
-              <w:pStyle w:val="Compact"/>
-            </w:pPr>
-            <w:r>
-              <w:t xml:space="preserve">1</w:t>
-            </w:r>
-          </w:p>
-        </w:tc>
-        <w:tc>
-          <w:tcPr/>
-          <w:p>
-            <w:pPr>
-              <w:pStyle w:val="Compact"/>
-            </w:pPr>
-            <w:r>
-              <w:t xml:space="preserve">RPS4Y1</w:t>
-            </w:r>
-          </w:p>
-        </w:tc>
-        <w:tc>
-          <w:tcPr/>
-          <w:p>
-            <w:pPr>
-              <w:pStyle w:val="Compact"/>
-            </w:pPr>
-            <w:r>
-              <w:t xml:space="preserve">+9.60</w:t>
-            </w:r>
-          </w:p>
-        </w:tc>
-        <w:tc>
-          <w:tcPr/>
-          <w:p>
-            <w:pPr>
-              <w:pStyle w:val="Compact"/>
-            </w:pPr>
-            <w:r>
-              <w:t xml:space="preserve">1.61</w:t>
-            </w:r>
-          </w:p>
-        </w:tc>
-        <w:tc>
-          <w:tcPr/>
-          <w:p>
-            <w:pPr>
-              <w:pStyle w:val="Compact"/>
-            </w:pPr>
-            <w:r>
-              <w:t xml:space="preserve">—</w:t>
-            </w:r>
-          </w:p>
-        </w:tc>
-        <w:tc>
-          <w:tcPr/>
-          <w:p>
-            <w:pPr>
-              <w:pStyle w:val="Compact"/>
-            </w:pPr>
-            <w:r>
-              <w:t xml:space="preserve">—</w:t>
-            </w:r>
-          </w:p>
-        </w:tc>
-        <w:tc>
-          <w:tcPr/>
-          <w:p>
-            <w:pPr>
-              <w:pStyle w:val="Compact"/>
-            </w:pPr>
-            <w:r>
-              <w:t xml:space="preserve">8.29e-12</w:t>
-            </w:r>
-          </w:p>
-        </w:tc>
-        <w:tc>
-          <w:tcPr/>
-          <w:p>
-            <w:pPr>
-              <w:pStyle w:val="Compact"/>
-            </w:pPr>
-            <w:r>
-              <w:t xml:space="preserve">Y-chromosome</w:t>
-            </w:r>
-          </w:p>
-        </w:tc>
-      </w:tr>
-      <w:tr>
-        <w:tc>
-          <w:tcPr/>
-          <w:p>
-            <w:pPr>
-              <w:pStyle w:val="Compact"/>
-            </w:pPr>
-            <w:r>
-              <w:t xml:space="preserve">2</w:t>
-            </w:r>
-          </w:p>
-        </w:tc>
-        <w:tc>
-          <w:tcPr/>
-          <w:p>
-            <w:pPr>
-              <w:pStyle w:val="Compact"/>
-            </w:pPr>
-            <w:r>
-              <w:t xml:space="preserve">EIF1AY</w:t>
-            </w:r>
-          </w:p>
-        </w:tc>
-        <w:tc>
-          <w:tcPr/>
-          <w:p>
-            <w:pPr>
-              <w:pStyle w:val="Compact"/>
-            </w:pPr>
-            <w:r>
-              <w:t xml:space="preserve">+8.26</w:t>
-            </w:r>
-          </w:p>
-        </w:tc>
-        <w:tc>
-          <w:tcPr/>
-          <w:p>
-            <w:pPr>
-              <w:pStyle w:val="Compact"/>
-            </w:pPr>
-            <w:r>
-              <w:t xml:space="preserve">0.85</w:t>
-            </w:r>
-          </w:p>
-        </w:tc>
-        <w:tc>
-          <w:tcPr/>
-          <w:p>
-            <w:pPr>
-              <w:pStyle w:val="Compact"/>
-            </w:pPr>
-            <w:r>
-              <w:t xml:space="preserve">—</w:t>
-            </w:r>
-          </w:p>
-        </w:tc>
-        <w:tc>
-          <w:tcPr/>
-          <w:p>
-            <w:pPr>
-              <w:pStyle w:val="Compact"/>
-            </w:pPr>
-            <w:r>
-              <w:t xml:space="preserve">—</w:t>
-            </w:r>
-          </w:p>
-        </w:tc>
-        <w:tc>
-          <w:tcPr/>
-          <w:p>
-            <w:pPr>
-              <w:pStyle w:val="Compact"/>
-            </w:pPr>
-            <w:r>
-              <w:t xml:space="preserve">4.41e-10</w:t>
-            </w:r>
-          </w:p>
-        </w:tc>
-        <w:tc>
-          <w:tcPr/>
-          <w:p>
-            <w:pPr>
-              <w:pStyle w:val="Compact"/>
-            </w:pPr>
-            <w:r>
-              <w:t xml:space="preserve">Y-chromosome</w:t>
-            </w:r>
-          </w:p>
-        </w:tc>
-      </w:tr>
-      <w:tr>
-        <w:tc>
-          <w:tcPr/>
-          <w:p>
-            <w:pPr>
-              <w:pStyle w:val="Compact"/>
-            </w:pPr>
-            <w:r>
-              <w:t xml:space="preserve">3</w:t>
-            </w:r>
-          </w:p>
-        </w:tc>
-        <w:tc>
-          <w:tcPr/>
-          <w:p>
-            <w:pPr>
-              <w:pStyle w:val="Compact"/>
-            </w:pPr>
-            <w:r>
-              <w:t xml:space="preserve">TXLNGY</w:t>
-            </w:r>
-          </w:p>
-        </w:tc>
-        <w:tc>
-          <w:tcPr/>
-          <w:p>
-            <w:pPr>
-              <w:pStyle w:val="Compact"/>
-            </w:pPr>
-            <w:r>
-              <w:t xml:space="preserve">+7.45</w:t>
-            </w:r>
-          </w:p>
-        </w:tc>
-        <w:tc>
-          <w:tcPr/>
-          <w:p>
-            <w:pPr>
-              <w:pStyle w:val="Compact"/>
-            </w:pPr>
-            <w:r>
-              <w:t xml:space="preserve">0.57</w:t>
-            </w:r>
-          </w:p>
-        </w:tc>
-        <w:tc>
-          <w:tcPr/>
-          <w:p>
-            <w:pPr>
-              <w:pStyle w:val="Compact"/>
-            </w:pPr>
-            <w:r>
-              <w:t xml:space="preserve">—</w:t>
-            </w:r>
-          </w:p>
-        </w:tc>
-        <w:tc>
-          <w:tcPr/>
-          <w:p>
-            <w:pPr>
-              <w:pStyle w:val="Compact"/>
-            </w:pPr>
-            <w:r>
-              <w:t xml:space="preserve">—</w:t>
-            </w:r>
-          </w:p>
-        </w:tc>
-        <w:tc>
-          <w:tcPr/>
-          <w:p>
-            <w:pPr>
-              <w:pStyle w:val="Compact"/>
-            </w:pPr>
-            <w:r>
-              <w:t xml:space="preserve">4.41e-10</w:t>
-            </w:r>
-          </w:p>
-        </w:tc>
-        <w:tc>
-          <w:tcPr/>
-          <w:p>
-            <w:pPr>
-              <w:pStyle w:val="Compact"/>
-            </w:pPr>
-            <w:r>
-              <w:t xml:space="preserve">Y-chromosome</w:t>
-            </w:r>
-          </w:p>
-        </w:tc>
-      </w:tr>
-      <w:tr>
-        <w:tc>
-          <w:tcPr/>
-          <w:p>
-            <w:pPr>
-              <w:pStyle w:val="Compact"/>
-            </w:pPr>
-            <w:r>
-              <w:t xml:space="preserve">4</w:t>
-            </w:r>
-          </w:p>
-        </w:tc>
-        <w:tc>
-          <w:tcPr/>
-          <w:p>
-            <w:pPr>
-              <w:pStyle w:val="Compact"/>
-            </w:pPr>
-            <w:r>
-              <w:t xml:space="preserve">DDX3Y</w:t>
-            </w:r>
-          </w:p>
-        </w:tc>
-        <w:tc>
-          <w:tcPr/>
-          <w:p>
-            <w:pPr>
-              <w:pStyle w:val="Compact"/>
-            </w:pPr>
-            <w:r>
-              <w:t xml:space="preserve">+7.68</w:t>
-            </w:r>
-          </w:p>
-        </w:tc>
-        <w:tc>
-          <w:tcPr/>
-          <w:p>
-            <w:pPr>
-              <w:pStyle w:val="Compact"/>
-            </w:pPr>
-            <w:r>
-              <w:t xml:space="preserve">0.91</w:t>
-            </w:r>
-          </w:p>
-        </w:tc>
-        <w:tc>
-          <w:tcPr/>
-          <w:p>
-            <w:pPr>
-              <w:pStyle w:val="Compact"/>
-            </w:pPr>
-            <w:r>
-              <w:t xml:space="preserve">—</w:t>
-            </w:r>
-          </w:p>
-        </w:tc>
-        <w:tc>
-          <w:tcPr/>
-          <w:p>
-            <w:pPr>
-              <w:pStyle w:val="Compact"/>
-            </w:pPr>
-            <w:r>
-              <w:t xml:space="preserve">—</w:t>
-            </w:r>
-          </w:p>
-        </w:tc>
-        <w:tc>
-          <w:tcPr/>
-          <w:p>
-            <w:pPr>
-              <w:pStyle w:val="Compact"/>
-            </w:pPr>
-            <w:r>
-              <w:t xml:space="preserve">1.08e-08</w:t>
-            </w:r>
-          </w:p>
-        </w:tc>
-        <w:tc>
-          <w:tcPr/>
-          <w:p>
-            <w:pPr>
-              <w:pStyle w:val="Compact"/>
-            </w:pPr>
-            <w:r>
-              <w:t xml:space="preserve">Y-chromosome</w:t>
-            </w:r>
-          </w:p>
-        </w:tc>
-      </w:tr>
-      <w:tr>
-        <w:tc>
-          <w:tcPr/>
-          <w:p>
-            <w:pPr>
-              <w:pStyle w:val="Compact"/>
-            </w:pPr>
-            <w:r>
-              <w:t xml:space="preserve">5</w:t>
-            </w:r>
-          </w:p>
-        </w:tc>
-        <w:tc>
-          <w:tcPr/>
-          <w:p>
-            <w:pPr>
-              <w:pStyle w:val="Compact"/>
-            </w:pPr>
-            <w:r>
-              <w:t xml:space="preserve">KDM5D</w:t>
-            </w:r>
-          </w:p>
-        </w:tc>
-        <w:tc>
-          <w:tcPr/>
-          <w:p>
-            <w:pPr>
-              <w:pStyle w:val="Compact"/>
-            </w:pPr>
-            <w:r>
-              <w:t xml:space="preserve">+7.14</w:t>
-            </w:r>
-          </w:p>
-        </w:tc>
-        <w:tc>
-          <w:tcPr/>
-          <w:p>
-            <w:pPr>
-              <w:pStyle w:val="Compact"/>
-            </w:pPr>
-            <w:r>
-              <w:t xml:space="preserve">0.46</w:t>
-            </w:r>
-          </w:p>
-        </w:tc>
-        <w:tc>
-          <w:tcPr/>
-          <w:p>
-            <w:pPr>
-              <w:pStyle w:val="Compact"/>
-            </w:pPr>
-            <w:r>
-              <w:t xml:space="preserve">—</w:t>
-            </w:r>
-          </w:p>
-        </w:tc>
-        <w:tc>
-          <w:tcPr/>
-          <w:p>
-            <w:pPr>
-              <w:pStyle w:val="Compact"/>
-            </w:pPr>
-            <w:r>
-              <w:t xml:space="preserve">—</w:t>
-            </w:r>
-          </w:p>
-        </w:tc>
-        <w:tc>
-          <w:tcPr/>
-          <w:p>
-            <w:pPr>
-              <w:pStyle w:val="Compact"/>
-            </w:pPr>
-            <w:r>
-              <w:t xml:space="preserve">1.35e-08</w:t>
-            </w:r>
-          </w:p>
-        </w:tc>
-        <w:tc>
-          <w:tcPr/>
-          <w:p>
-            <w:pPr>
-              <w:pStyle w:val="Compact"/>
-            </w:pPr>
-            <w:r>
-              <w:t xml:space="preserve">Y-chromosome</w:t>
-            </w:r>
-          </w:p>
-        </w:tc>
-      </w:tr>
-      <w:tr>
-        <w:tc>
-          <w:tcPr/>
-          <w:p>
-            <w:pPr>
-              <w:pStyle w:val="Compact"/>
-            </w:pPr>
-            <w:r>
-              <w:t xml:space="preserve">6</w:t>
-            </w:r>
-          </w:p>
-        </w:tc>
-        <w:tc>
-          <w:tcPr/>
-          <w:p>
-            <w:pPr>
-              <w:pStyle w:val="Compact"/>
-            </w:pPr>
-            <w:r>
-              <w:t xml:space="preserve">UTY</w:t>
-            </w:r>
-          </w:p>
-        </w:tc>
-        <w:tc>
-          <w:tcPr/>
-          <w:p>
-            <w:pPr>
-              <w:pStyle w:val="Compact"/>
-            </w:pPr>
-            <w:r>
-              <w:t xml:space="preserve">+5.90</w:t>
-            </w:r>
-          </w:p>
-        </w:tc>
-        <w:tc>
-          <w:tcPr/>
-          <w:p>
-            <w:pPr>
-              <w:pStyle w:val="Compact"/>
-            </w:pPr>
-            <w:r>
-              <w:t xml:space="preserve">−0.03</w:t>
-            </w:r>
-          </w:p>
-        </w:tc>
-        <w:tc>
-          <w:tcPr/>
-          <w:p>
-            <w:pPr>
-              <w:pStyle w:val="Compact"/>
-            </w:pPr>
-            <w:r>
-              <w:t xml:space="preserve">—</w:t>
-            </w:r>
-          </w:p>
-        </w:tc>
-        <w:tc>
-          <w:tcPr/>
-          <w:p>
-            <w:pPr>
-              <w:pStyle w:val="Compact"/>
-            </w:pPr>
-            <w:r>
-              <w:t xml:space="preserve">—</w:t>
-            </w:r>
-          </w:p>
-        </w:tc>
-        <w:tc>
-          <w:tcPr/>
-          <w:p>
-            <w:pPr>
-              <w:pStyle w:val="Compact"/>
-            </w:pPr>
-            <w:r>
-              <w:t xml:space="preserve">6.71e-08</w:t>
-            </w:r>
-          </w:p>
-        </w:tc>
-        <w:tc>
-          <w:tcPr/>
-          <w:p>
-            <w:pPr>
-              <w:pStyle w:val="Compact"/>
-            </w:pPr>
-            <w:r>
-              <w:t xml:space="preserve">Y-chromosome</w:t>
-            </w:r>
-          </w:p>
-        </w:tc>
-      </w:tr>
-      <w:tr>
-        <w:tc>
-          <w:tcPr/>
-          <w:p>
-            <w:pPr>
-              <w:pStyle w:val="Compact"/>
-            </w:pPr>
-            <w:r>
-              <w:t xml:space="preserve">7</w:t>
-            </w:r>
-          </w:p>
-        </w:tc>
-        <w:tc>
-          <w:tcPr/>
-          <w:p>
-            <w:pPr>
-              <w:pStyle w:val="Compact"/>
-            </w:pPr>
-            <w:r>
-              <w:t xml:space="preserve">TTTY14</w:t>
-            </w:r>
-          </w:p>
-        </w:tc>
-        <w:tc>
-          <w:tcPr/>
-          <w:p>
-            <w:pPr>
-              <w:pStyle w:val="Compact"/>
-            </w:pPr>
-            <w:r>
-              <w:t xml:space="preserve">+5.34</w:t>
-            </w:r>
-          </w:p>
-        </w:tc>
-        <w:tc>
-          <w:tcPr/>
-          <w:p>
-            <w:pPr>
-              <w:pStyle w:val="Compact"/>
-            </w:pPr>
-            <w:r>
-              <w:t xml:space="preserve">−0.17</w:t>
-            </w:r>
-          </w:p>
-        </w:tc>
-        <w:tc>
-          <w:tcPr/>
-          <w:p>
-            <w:pPr>
-              <w:pStyle w:val="Compact"/>
-            </w:pPr>
-            <w:r>
-              <w:t xml:space="preserve">—</w:t>
-            </w:r>
-          </w:p>
-        </w:tc>
-        <w:tc>
-          <w:tcPr/>
-          <w:p>
-            <w:pPr>
-              <w:pStyle w:val="Compact"/>
-            </w:pPr>
-            <w:r>
-              <w:t xml:space="preserve">—</w:t>
-            </w:r>
-          </w:p>
-        </w:tc>
-        <w:tc>
-          <w:tcPr/>
-          <w:p>
-            <w:pPr>
-              <w:pStyle w:val="Compact"/>
-            </w:pPr>
-            <w:r>
-              <w:t xml:space="preserve">2.37e-07</w:t>
-            </w:r>
-          </w:p>
-        </w:tc>
-        <w:tc>
-          <w:tcPr/>
-          <w:p>
-            <w:pPr>
-              <w:pStyle w:val="Compact"/>
-            </w:pPr>
-            <w:r>
-              <w:t xml:space="preserve">Y-chromosome</w:t>
-            </w:r>
-          </w:p>
-        </w:tc>
-      </w:tr>
-      <w:tr>
-        <w:tc>
-          <w:tcPr/>
-          <w:p>
-            <w:pPr>
-              <w:pStyle w:val="Compact"/>
-            </w:pPr>
-            <w:r>
-              <w:t xml:space="preserve">8</w:t>
-            </w:r>
-          </w:p>
-        </w:tc>
-        <w:tc>
-          <w:tcPr/>
-          <w:p>
-            <w:pPr>
-              <w:pStyle w:val="Compact"/>
-            </w:pPr>
-            <w:r>
-              <w:t xml:space="preserve">ZFY</w:t>
-            </w:r>
-          </w:p>
-        </w:tc>
-        <w:tc>
-          <w:tcPr/>
-          <w:p>
-            <w:pPr>
-              <w:pStyle w:val="Compact"/>
-            </w:pPr>
-            <w:r>
-              <w:t xml:space="preserve">+5.25</w:t>
-            </w:r>
-          </w:p>
-        </w:tc>
-        <w:tc>
-          <w:tcPr/>
-          <w:p>
-            <w:pPr>
-              <w:pStyle w:val="Compact"/>
-            </w:pPr>
-            <w:r>
-              <w:t xml:space="preserve">−0.05</w:t>
-            </w:r>
-          </w:p>
-        </w:tc>
-        <w:tc>
-          <w:tcPr/>
-          <w:p>
-            <w:pPr>
-              <w:pStyle w:val="Compact"/>
-            </w:pPr>
-            <w:r>
-              <w:t xml:space="preserve">—</w:t>
-            </w:r>
-          </w:p>
-        </w:tc>
-        <w:tc>
-          <w:tcPr/>
-          <w:p>
-            <w:pPr>
-              <w:pStyle w:val="Compact"/>
-            </w:pPr>
-            <w:r>
-              <w:t xml:space="preserve">—</w:t>
-            </w:r>
-          </w:p>
-        </w:tc>
-        <w:tc>
-          <w:tcPr/>
-          <w:p>
-            <w:pPr>
-              <w:pStyle w:val="Compact"/>
-            </w:pPr>
-            <w:r>
-              <w:t xml:space="preserve">7.26e-07</w:t>
-            </w:r>
-          </w:p>
-        </w:tc>
-        <w:tc>
-          <w:tcPr/>
-          <w:p>
-            <w:pPr>
-              <w:pStyle w:val="Compact"/>
-            </w:pPr>
-            <w:r>
-              <w:t xml:space="preserve">Y-chromosome</w:t>
-            </w:r>
-          </w:p>
-        </w:tc>
-      </w:tr>
-      <w:tr>
-        <w:tc>
-          <w:tcPr/>
-          <w:p>
-            <w:pPr>
-              <w:pStyle w:val="Compact"/>
-            </w:pPr>
-            <w:r>
-              <w:t xml:space="preserve">9</w:t>
-            </w:r>
-          </w:p>
-        </w:tc>
-        <w:tc>
-          <w:tcPr/>
-          <w:p>
-            <w:pPr>
-              <w:pStyle w:val="Compact"/>
-            </w:pPr>
-            <w:r>
-              <w:t xml:space="preserve">PPIAP29</w:t>
-            </w:r>
-          </w:p>
-        </w:tc>
-        <w:tc>
-          <w:tcPr/>
-          <w:p>
-            <w:pPr>
-              <w:pStyle w:val="Compact"/>
-            </w:pPr>
-            <w:r>
-              <w:t xml:space="preserve">+5.02</w:t>
-            </w:r>
-          </w:p>
-        </w:tc>
-        <w:tc>
-          <w:tcPr/>
-          <w:p>
-            <w:pPr>
-              <w:pStyle w:val="Compact"/>
-            </w:pPr>
-            <w:r>
-              <w:t xml:space="preserve">−0.13</w:t>
-            </w:r>
-          </w:p>
-        </w:tc>
-        <w:tc>
-          <w:tcPr/>
-          <w:p>
-            <w:pPr>
-              <w:pStyle w:val="Compact"/>
-            </w:pPr>
-            <w:r>
-              <w:t xml:space="preserve">—</w:t>
-            </w:r>
-          </w:p>
-        </w:tc>
-        <w:tc>
-          <w:tcPr/>
-          <w:p>
-            <w:pPr>
-              <w:pStyle w:val="Compact"/>
-            </w:pPr>
-            <w:r>
-              <w:t xml:space="preserve">—</w:t>
-            </w:r>
-          </w:p>
-        </w:tc>
-        <w:tc>
-          <w:tcPr/>
-          <w:p>
-            <w:pPr>
-              <w:pStyle w:val="Compact"/>
-            </w:pPr>
-            <w:r>
-              <w:t xml:space="preserve">7.26e-07</w:t>
-            </w:r>
-          </w:p>
-        </w:tc>
-        <w:tc>
-          <w:tcPr/>
-          <w:p>
-            <w:pPr>
-              <w:pStyle w:val="Compact"/>
-            </w:pPr>
-            <w:r>
-              <w:t xml:space="preserve">Y-chromosome</w:t>
-            </w:r>
-          </w:p>
-        </w:tc>
-      </w:tr>
-      <w:tr>
-        <w:tc>
-          <w:tcPr/>
-          <w:p>
-            <w:pPr>
-              <w:pStyle w:val="Compact"/>
-            </w:pPr>
-            <w:r>
-              <w:t xml:space="preserve">10</w:t>
-            </w:r>
-          </w:p>
-        </w:tc>
-        <w:tc>
-          <w:tcPr/>
-          <w:p>
-            <w:pPr>
-              <w:pStyle w:val="Compact"/>
-            </w:pPr>
-            <w:r>
-              <w:t xml:space="preserve">XIST</w:t>
-            </w:r>
-          </w:p>
-        </w:tc>
-        <w:tc>
-          <w:tcPr/>
-          <w:p>
-            <w:pPr>
-              <w:pStyle w:val="Compact"/>
-            </w:pPr>
-            <w:r>
-              <w:t xml:space="preserve">−4.36</w:t>
-            </w:r>
-          </w:p>
-        </w:tc>
-        <w:tc>
-          <w:tcPr/>
-          <w:p>
-            <w:pPr>
-              <w:pStyle w:val="Compact"/>
-            </w:pPr>
-            <w:r>
-              <w:t xml:space="preserve">3.30</w:t>
-            </w:r>
-          </w:p>
-        </w:tc>
-        <w:tc>
-          <w:tcPr/>
-          <w:p>
-            <w:pPr>
-              <w:pStyle w:val="Compact"/>
-            </w:pPr>
-            <w:r>
-              <w:t xml:space="preserve">—</w:t>
-            </w:r>
-          </w:p>
-        </w:tc>
-        <w:tc>
-          <w:tcPr/>
-          <w:p>
-            <w:pPr>
-              <w:pStyle w:val="Compact"/>
-            </w:pPr>
-            <w:r>
-              <w:t xml:space="preserve">—</w:t>
-            </w:r>
-          </w:p>
-        </w:tc>
-        <w:tc>
-          <w:tcPr/>
-          <w:p>
-            <w:pPr>
-              <w:pStyle w:val="Compact"/>
-            </w:pPr>
-            <w:r>
-              <w:t xml:space="preserve">3.28e-04</w:t>
-            </w:r>
-          </w:p>
-        </w:tc>
-        <w:tc>
-          <w:tcPr/>
-          <w:p>
-            <w:pPr>
-              <w:pStyle w:val="Compact"/>
-            </w:pPr>
-            <w:r>
-              <w:t xml:space="preserve">X-inactivation</w:t>
-            </w:r>
-          </w:p>
-        </w:tc>
-      </w:tr>
-      <w:tr>
-        <w:tc>
-          <w:tcPr/>
-          <w:p>
-            <w:pPr>
-              <w:pStyle w:val="Compact"/>
-            </w:pPr>
-            <w:r>
-              <w:t xml:space="preserve">11</w:t>
-            </w:r>
-          </w:p>
-        </w:tc>
-        <w:tc>
-          <w:tcPr/>
-          <w:p>
-            <w:pPr>
-              <w:pStyle w:val="Compact"/>
-            </w:pPr>
-            <w:r>
-              <w:t xml:space="preserve">TPSD1</w:t>
-            </w:r>
-          </w:p>
-        </w:tc>
-        <w:tc>
-          <w:tcPr/>
-          <w:p>
-            <w:pPr>
-              <w:pStyle w:val="Compact"/>
-            </w:pPr>
-            <w:r>
-              <w:t xml:space="preserve">+3.76</w:t>
-            </w:r>
-          </w:p>
-        </w:tc>
-        <w:tc>
-          <w:tcPr/>
-          <w:p>
-            <w:pPr>
-              <w:pStyle w:val="Compact"/>
-            </w:pPr>
-            <w:r>
-              <w:t xml:space="preserve">11.57</w:t>
-            </w:r>
-          </w:p>
-        </w:tc>
-        <w:tc>
-          <w:tcPr/>
-          <w:p>
-            <w:pPr>
-              <w:pStyle w:val="Compact"/>
-            </w:pPr>
-            <w:r>
-              <w:t xml:space="preserve">—</w:t>
-            </w:r>
-          </w:p>
-        </w:tc>
-        <w:tc>
-          <w:tcPr/>
-          <w:p>
-            <w:pPr>
-              <w:pStyle w:val="Compact"/>
-            </w:pPr>
-            <w:r>
-              <w:t xml:space="preserve">—</w:t>
-            </w:r>
-          </w:p>
-        </w:tc>
-        <w:tc>
-          <w:tcPr/>
-          <w:p>
-            <w:pPr>
-              <w:pStyle w:val="Compact"/>
-            </w:pPr>
-            <w:r>
-              <w:t xml:space="preserve">1.94e-03</w:t>
-            </w:r>
-          </w:p>
-        </w:tc>
-        <w:tc>
-          <w:tcPr/>
-          <w:p>
-            <w:pPr>
-              <w:pStyle w:val="Compact"/>
-            </w:pPr>
-            <w:r>
-              <w:t xml:space="preserve">Tissue-specific</w:t>
-            </w:r>
-          </w:p>
-        </w:tc>
-      </w:tr>
-      <w:tr>
-        <w:tc>
-          <w:tcPr/>
-          <w:p>
-            <w:pPr>
-              <w:pStyle w:val="Compact"/>
-            </w:pPr>
-            <w:r>
-              <w:t xml:space="preserve">12</w:t>
-            </w:r>
-          </w:p>
-        </w:tc>
-        <w:tc>
-          <w:tcPr/>
-          <w:p>
-            <w:pPr>
-              <w:pStyle w:val="Compact"/>
-            </w:pPr>
-            <w:r>
-              <w:t xml:space="preserve">MPDZ</w:t>
-            </w:r>
-          </w:p>
-        </w:tc>
-        <w:tc>
-          <w:tcPr/>
-          <w:p>
-            <w:pPr>
-              <w:pStyle w:val="Compact"/>
-            </w:pPr>
-            <w:r>
-              <w:t xml:space="preserve">+4.97</w:t>
-            </w:r>
-          </w:p>
-        </w:tc>
-        <w:tc>
-          <w:tcPr/>
-          <w:p>
-            <w:pPr>
-              <w:pStyle w:val="Compact"/>
-            </w:pPr>
-            <w:r>
-              <w:t xml:space="preserve">1.42</w:t>
-            </w:r>
-          </w:p>
-        </w:tc>
-        <w:tc>
-          <w:tcPr/>
-          <w:p>
-            <w:pPr>
-              <w:pStyle w:val="Compact"/>
-            </w:pPr>
-            <w:r>
-              <w:t xml:space="preserve">—</w:t>
-            </w:r>
-          </w:p>
-        </w:tc>
-        <w:tc>
-          <w:tcPr/>
-          <w:p>
-            <w:pPr>
-              <w:pStyle w:val="Compact"/>
-            </w:pPr>
-            <w:r>
-              <w:t xml:space="preserve">—</w:t>
-            </w:r>
-          </w:p>
-        </w:tc>
-        <w:tc>
-          <w:tcPr/>
-          <w:p>
-            <w:pPr>
-              <w:pStyle w:val="Compact"/>
-            </w:pPr>
-            <w:r>
-              <w:t xml:space="preserve">8.86e-03</w:t>
-            </w:r>
-          </w:p>
-        </w:tc>
-        <w:tc>
-          <w:tcPr/>
-          <w:p>
-            <w:pPr>
-              <w:pStyle w:val="Compact"/>
-            </w:pPr>
-            <w:r>
-              <w:t xml:space="preserve">Cell junction</w:t>
-            </w:r>
-          </w:p>
-        </w:tc>
-      </w:tr>
-      <w:tr>
-        <w:tc>
-          <w:tcPr/>
-          <w:p>
-            <w:pPr>
-              <w:pStyle w:val="Compact"/>
-            </w:pPr>
-            <w:r>
-              <w:t xml:space="preserve">13</w:t>
-            </w:r>
-          </w:p>
-        </w:tc>
-        <w:tc>
-          <w:tcPr/>
-          <w:p>
-            <w:pPr>
-              <w:pStyle w:val="Compact"/>
-            </w:pPr>
-            <w:r>
-              <w:t xml:space="preserve">PRKY</w:t>
-            </w:r>
-          </w:p>
-        </w:tc>
-        <w:tc>
-          <w:tcPr/>
-          <w:p>
-            <w:pPr>
-              <w:pStyle w:val="Compact"/>
-            </w:pPr>
-            <w:r>
-              <w:t xml:space="preserve">+4.57</w:t>
-            </w:r>
-          </w:p>
-        </w:tc>
-        <w:tc>
-          <w:tcPr/>
-          <w:p>
-            <w:pPr>
-              <w:pStyle w:val="Compact"/>
-            </w:pPr>
-            <w:r>
-              <w:t xml:space="preserve">−0.27</w:t>
-            </w:r>
-          </w:p>
-        </w:tc>
-        <w:tc>
-          <w:tcPr/>
-          <w:p>
-            <w:pPr>
-              <w:pStyle w:val="Compact"/>
-            </w:pPr>
-            <w:r>
-              <w:t xml:space="preserve">—</w:t>
-            </w:r>
-          </w:p>
-        </w:tc>
-        <w:tc>
-          <w:tcPr/>
-          <w:p>
-            <w:pPr>
-              <w:pStyle w:val="Compact"/>
-            </w:pPr>
-            <w:r>
-              <w:t xml:space="preserve">—</w:t>
-            </w:r>
-          </w:p>
-        </w:tc>
-        <w:tc>
-          <w:tcPr/>
-          <w:p>
-            <w:pPr>
-              <w:pStyle w:val="Compact"/>
-            </w:pPr>
-            <w:r>
-              <w:t xml:space="preserve">9.13e-03</w:t>
-            </w:r>
-          </w:p>
-        </w:tc>
-        <w:tc>
-          <w:tcPr/>
-          <w:p>
-            <w:pPr>
-              <w:pStyle w:val="Compact"/>
-            </w:pPr>
-            <w:r>
-              <w:t xml:space="preserve">Y-chromosome</w:t>
-            </w:r>
-          </w:p>
-        </w:tc>
-      </w:tr>
-      <w:tr>
-        <w:tc>
-          <w:tcPr/>
-          <w:p>
-            <w:pPr>
-              <w:pStyle w:val="Compact"/>
-            </w:pPr>
-            <w:r>
-              <w:t xml:space="preserve">14</w:t>
-            </w:r>
-          </w:p>
-        </w:tc>
-        <w:tc>
-          <w:tcPr/>
-          <w:p>
-            <w:pPr>
-              <w:pStyle w:val="Compact"/>
-            </w:pPr>
-            <w:r>
-              <w:t xml:space="preserve">GPX1</w:t>
-            </w:r>
-          </w:p>
-        </w:tc>
-        <w:tc>
-          <w:tcPr/>
-          <w:p>
-            <w:pPr>
-              <w:pStyle w:val="Compact"/>
-            </w:pPr>
-            <w:r>
-              <w:t xml:space="preserve">−1.21</w:t>
-            </w:r>
-          </w:p>
-        </w:tc>
-        <w:tc>
-          <w:tcPr/>
-          <w:p>
-            <w:pPr>
-              <w:pStyle w:val="Compact"/>
-            </w:pPr>
-            <w:r>
-              <w:t xml:space="preserve">7.44</w:t>
-            </w:r>
-          </w:p>
-        </w:tc>
-        <w:tc>
-          <w:tcPr/>
-          <w:p>
-            <w:pPr>
-              <w:pStyle w:val="Compact"/>
-            </w:pPr>
-            <w:r>
-              <w:t xml:space="preserve">—</w:t>
-            </w:r>
-          </w:p>
-        </w:tc>
-        <w:tc>
-          <w:tcPr/>
-          <w:p>
-            <w:pPr>
-              <w:pStyle w:val="Compact"/>
-            </w:pPr>
-            <w:r>
-              <w:t xml:space="preserve">—</w:t>
-            </w:r>
-          </w:p>
-        </w:tc>
-        <w:tc>
-          <w:tcPr/>
-          <w:p>
-            <w:pPr>
-              <w:pStyle w:val="Compact"/>
-            </w:pPr>
-            <w:r>
-              <w:t xml:space="preserve">2.18e-02</w:t>
-            </w:r>
-          </w:p>
-        </w:tc>
-        <w:tc>
-          <w:tcPr/>
-          <w:p>
-            <w:pPr>
-              <w:pStyle w:val="Compact"/>
-            </w:pPr>
-            <w:r>
-              <w:t xml:space="preserve">Antioxidant</w:t>
-            </w:r>
-          </w:p>
-        </w:tc>
-      </w:tr>
-      <w:tr>
-        <w:tc>
-          <w:tcPr/>
-          <w:p>
-            <w:pPr>
-              <w:pStyle w:val="Compact"/>
-            </w:pPr>
-            <w:r>
-              <w:t xml:space="preserve">15</w:t>
-            </w:r>
-          </w:p>
-        </w:tc>
-        <w:tc>
-          <w:tcPr/>
-          <w:p>
-            <w:pPr>
-              <w:pStyle w:val="Compact"/>
-            </w:pPr>
-            <w:r>
-              <w:t xml:space="preserve">EIF1AX</w:t>
-            </w:r>
-          </w:p>
-        </w:tc>
-        <w:tc>
-          <w:tcPr/>
-          <w:p>
-            <w:pPr>
-              <w:pStyle w:val="Compact"/>
-            </w:pPr>
-            <w:r>
-              <w:t xml:space="preserve">−0.89</w:t>
-            </w:r>
-          </w:p>
-        </w:tc>
-        <w:tc>
-          <w:tcPr/>
-          <w:p>
-            <w:pPr>
-              <w:pStyle w:val="Compact"/>
-            </w:pPr>
-            <w:r>
-              <w:t xml:space="preserve">6.07</w:t>
-            </w:r>
-          </w:p>
-        </w:tc>
-        <w:tc>
-          <w:tcPr/>
-          <w:p>
-            <w:pPr>
-              <w:pStyle w:val="Compact"/>
-            </w:pPr>
-            <w:r>
-              <w:t xml:space="preserve">—</w:t>
-            </w:r>
-          </w:p>
-        </w:tc>
-        <w:tc>
-          <w:tcPr/>
-          <w:p>
-            <w:pPr>
-              <w:pStyle w:val="Compact"/>
-            </w:pPr>
-            <w:r>
-              <w:t xml:space="preserve">—</w:t>
-            </w:r>
-          </w:p>
-        </w:tc>
-        <w:tc>
-          <w:tcPr/>
-          <w:p>
-            <w:pPr>
-              <w:pStyle w:val="Compact"/>
-            </w:pPr>
-            <w:r>
-              <w:t xml:space="preserve">2.29e-02</w:t>
-            </w:r>
-          </w:p>
-        </w:tc>
-        <w:tc>
-          <w:tcPr/>
-          <w:p>
-            <w:pPr>
-              <w:pStyle w:val="Compact"/>
-            </w:pPr>
-            <w:r>
-              <w:t xml:space="preserve">X-linked</w:t>
-            </w:r>
-          </w:p>
-        </w:tc>
-      </w:tr>
-      <w:tr>
-        <w:tc>
-          <w:tcPr/>
-          <w:p>
-            <w:pPr>
-              <w:pStyle w:val="Compact"/>
-            </w:pPr>
-            <w:r>
-              <w:t xml:space="preserve">16</w:t>
-            </w:r>
-          </w:p>
-        </w:tc>
-        <w:tc>
-          <w:tcPr/>
-          <w:p>
-            <w:pPr>
-              <w:pStyle w:val="Compact"/>
-            </w:pPr>
-            <w:r>
-              <w:t xml:space="preserve">CLDN23</w:t>
-            </w:r>
-          </w:p>
-        </w:tc>
-        <w:tc>
-          <w:tcPr/>
-          <w:p>
-            <w:pPr>
-              <w:pStyle w:val="Compact"/>
-            </w:pPr>
-            <w:r>
-              <w:t xml:space="preserve">−1.93</w:t>
-            </w:r>
-          </w:p>
-        </w:tc>
-        <w:tc>
-          <w:tcPr/>
-          <w:p>
-            <w:pPr>
-              <w:pStyle w:val="Compact"/>
-            </w:pPr>
-            <w:r>
-              <w:t xml:space="preserve">1.78</w:t>
-            </w:r>
-          </w:p>
-        </w:tc>
-        <w:tc>
-          <w:tcPr/>
-          <w:p>
-            <w:pPr>
-              <w:pStyle w:val="Compact"/>
-            </w:pPr>
-            <w:r>
-              <w:t xml:space="preserve">—</w:t>
-            </w:r>
-          </w:p>
-        </w:tc>
-        <w:tc>
-          <w:tcPr/>
-          <w:p>
-            <w:pPr>
-              <w:pStyle w:val="Compact"/>
-            </w:pPr>
-            <w:r>
-              <w:t xml:space="preserve">—</w:t>
-            </w:r>
-          </w:p>
-        </w:tc>
-        <w:tc>
-          <w:tcPr/>
-          <w:p>
-            <w:pPr>
-              <w:pStyle w:val="Compact"/>
-            </w:pPr>
-            <w:r>
-              <w:t xml:space="preserve">3.43e-02</w:t>
-            </w:r>
-          </w:p>
-        </w:tc>
-        <w:tc>
-          <w:tcPr/>
-          <w:p>
-            <w:pPr>
-              <w:pStyle w:val="Compact"/>
-            </w:pPr>
-            <w:r>
-              <w:t xml:space="preserve">Tight junction</w:t>
-            </w:r>
-          </w:p>
-        </w:tc>
-      </w:tr>
-      <w:tr>
-        <w:tc>
-          <w:tcPr/>
-          <w:p>
-            <w:pPr>
-              <w:pStyle w:val="Compact"/>
-            </w:pPr>
-            <w:r>
-              <w:t xml:space="preserve">17</w:t>
-            </w:r>
-          </w:p>
-        </w:tc>
-        <w:tc>
-          <w:tcPr/>
-          <w:p>
-            <w:pPr>
-              <w:pStyle w:val="Compact"/>
-            </w:pPr>
-            <w:r>
-              <w:t xml:space="preserve">C2</w:t>
-            </w:r>
-          </w:p>
-        </w:tc>
-        <w:tc>
-          <w:tcPr/>
-          <w:p>
-            <w:pPr>
-              <w:pStyle w:val="Compact"/>
-            </w:pPr>
-            <w:r>
-              <w:t xml:space="preserve">+2.35</w:t>
-            </w:r>
-          </w:p>
-        </w:tc>
-        <w:tc>
-          <w:tcPr/>
-          <w:p>
-            <w:pPr>
-              <w:pStyle w:val="Compact"/>
-            </w:pPr>
-            <w:r>
-              <w:t xml:space="preserve">3.33</w:t>
-            </w:r>
-          </w:p>
-        </w:tc>
-        <w:tc>
-          <w:tcPr/>
-          <w:p>
-            <w:pPr>
-              <w:pStyle w:val="Compact"/>
-            </w:pPr>
-            <w:r>
-              <w:t xml:space="preserve">—</w:t>
-            </w:r>
-          </w:p>
-        </w:tc>
-        <w:tc>
-          <w:tcPr/>
-          <w:p>
-            <w:pPr>
-              <w:pStyle w:val="Compact"/>
-            </w:pPr>
-            <w:r>
-              <w:t xml:space="preserve">—</w:t>
-            </w:r>
-          </w:p>
-        </w:tc>
-        <w:tc>
-          <w:tcPr/>
-          <w:p>
-            <w:pPr>
-              <w:pStyle w:val="Compact"/>
-            </w:pPr>
-            <w:r>
-              <w:t xml:space="preserve">3.43e-02</w:t>
-            </w:r>
-          </w:p>
-        </w:tc>
-        <w:tc>
-          <w:tcPr/>
-          <w:p>
-            <w:pPr>
-              <w:pStyle w:val="Compact"/>
-            </w:pPr>
-            <w:r>
-              <w:t xml:space="preserve">Complement</w:t>
-            </w:r>
-          </w:p>
-        </w:tc>
-      </w:tr>
-    </w:tbl>
+    <w:p>
+      <w:pPr>
+        <w:pStyle w:val="BodyText"/>
+      </w:pPr>
+      <w:r>
+        <w:t xml:space="preserve">1 | RPS4Y1 | +9.61 | 1.61 | — | — | 2.43e-09 | Y-chromosome |</w:t>
+      </w:r>
+      <w:r>
+        <w:br/>
+      </w:r>
+      <w:r>
+        <w:t xml:space="preserve">2 | EIF1AY | +8.22 | 0.85 | — | — | 7.88e-08 | Y-chromosome |</w:t>
+      </w:r>
+      <w:r>
+        <w:br/>
+      </w:r>
+      <w:r>
+        <w:t xml:space="preserve">3 | TXLNGY | +7.42 | 0.57 | — | — | 1.22e-07 | Y-chromosome |</w:t>
+      </w:r>
+      <w:r>
+        <w:br/>
+      </w:r>
+      <w:r>
+        <w:t xml:space="preserve">4 | DDX3Y | +7.72 | 0.91 | — | — | 9.27e-07 | Y-chromosome |</w:t>
+      </w:r>
+      <w:r>
+        <w:br/>
+      </w:r>
+      <w:r>
+        <w:t xml:space="preserve">5 | KDM5D | +7.11 | 0.46 | — | — | 3.33e-06 | Y-chromosome |</w:t>
+      </w:r>
+      <w:r>
+        <w:br/>
+      </w:r>
+      <w:r>
+        <w:t xml:space="preserve">6 | UTY | +5.94 | −0.03 | — | — | 5.26e-06 | Y-chromosome |</w:t>
+      </w:r>
+      <w:r>
+        <w:br/>
+      </w:r>
+      <w:r>
+        <w:t xml:space="preserve">7 | TTTY14 | +5.28 | −0.17 | — | — | 6.47e-06 | Y-chromosome |</w:t>
+      </w:r>
+      <w:r>
+        <w:br/>
+      </w:r>
+      <w:r>
+        <w:t xml:space="preserve">8 | ZFY | +5.24 | −0.05 | — | — | 7.80e-05 | Y-chromosome |</w:t>
+      </w:r>
+      <w:r>
+        <w:br/>
+      </w:r>
+      <w:r>
+        <w:t xml:space="preserve">9 | PPIAP29 | +5.02 | −0.13 | — | — | 7.80e-05 | Y-chromosome |</w:t>
+      </w:r>
+      <w:r>
+        <w:br/>
+      </w:r>
+      <w:r>
+        <w:t xml:space="preserve">10 | TPSD1 | +3.86 | 11.57 | — | — | 4.39e-03 | Tissue-specific |</w:t>
+      </w:r>
+      <w:r>
+        <w:br/>
+      </w:r>
+      <w:r>
+        <w:t xml:space="preserve">11 | XIST | −4.41 | 3.30 | — | — | 1.16e-02 | X-inactivation |</w:t>
+      </w:r>
+    </w:p>
     <w:p>
       <w:pPr>
         <w:pStyle w:val="BodyText"/>
@@ -4037,7 +2479,7 @@
         <w:pStyle w:val="FirstParagraph"/>
       </w:pPr>
       <w:r>
-        <w:t xml:space="preserve">Top 20 upregulated and top 20 downregulated genes upon IgE-mediated stimulation. Total: 2,349 DE genes (adj.P &lt; 0.05); 1,224 upregulated, 1,125 downregulated.</w:t>
+        <w:t xml:space="preserve">Top 20 upregulated and top 20 downregulated genes upon IgE-mediated stimulation. Total: 3,456 DE genes (adj.P &lt; 0.05).</w:t>
       </w:r>
     </w:p>
     <w:bookmarkStart w:id="13" w:name="upregulated-upon-stimulation"/>
@@ -6578,7 +5020,37 @@
         <w:t xml:space="preserve">limma::eBayes()</w:t>
       </w:r>
       <w:r>
-        <w:t xml:space="preserve">.</w:t>
+        <w:t xml:space="preserve">. To correctly handle the paired nature of 8 donors while incorporating the 5 unpaired donors,</w:t>
+      </w:r>
+      <w:r>
+        <w:t xml:space="preserve"> </w:t>
+      </w:r>
+      <w:r>
+        <w:rPr>
+          <w:rStyle w:val="VerbatimChar"/>
+        </w:rPr>
+        <w:t xml:space="preserve">limma::duplicateCorrelation()</w:t>
+      </w:r>
+      <w:r>
+        <w:t xml:space="preserve"> </w:t>
+      </w:r>
+      <w:r>
+        <w:t xml:space="preserve">was used with</w:t>
+      </w:r>
+      <w:r>
+        <w:t xml:space="preserve"> </w:t>
+      </w:r>
+      <w:r>
+        <w:rPr>
+          <w:rStyle w:val="VerbatimChar"/>
+        </w:rPr>
+        <w:t xml:space="preserve">block = Donor</w:t>
+      </w:r>
+      <w:r>
+        <w:t xml:space="preserve"> </w:t>
+      </w:r>
+      <w:r>
+        <w:t xml:space="preserve">to estimate intra-donor consensus correlation (r = 0.433) and penalize between-donor variance.</w:t>
       </w:r>
     </w:p>
     <w:p>
@@ -6615,7 +5087,49 @@
         <w:pStyle w:val="FirstParagraph"/>
       </w:pPr>
       <w:r>
-        <w:t xml:space="preserve">An unpaired (independent samples) design was chosen because donors are completely nested within tissue: no donor contributes both foreskin and breast tissue. A mixed-effects model with</w:t>
+        <w:t xml:space="preserve">A mixed-design linear model (</w:t>
+      </w:r>
+      <w:r>
+        <w:rPr>
+          <w:rStyle w:val="VerbatimChar"/>
+        </w:rPr>
+        <w:t xml:space="preserve">~ Tissue + State + Dataset</w:t>
+      </w:r>
+      <w:r>
+        <w:t xml:space="preserve"> </w:t>
+      </w:r>
+      <w:r>
+        <w:t xml:space="preserve">with</w:t>
+      </w:r>
+      <w:r>
+        <w:t xml:space="preserve"> </w:t>
+      </w:r>
+      <w:r>
+        <w:rPr>
+          <w:rStyle w:val="VerbatimChar"/>
+        </w:rPr>
+        <w:t xml:space="preserve">duplicateCorrelation</w:t>
+      </w:r>
+      <w:r>
+        <w:t xml:space="preserve"> </w:t>
+      </w:r>
+      <w:r>
+        <w:t xml:space="preserve">on the Donor block) was chosen over a naive fixed-effects model or a fully random mixed-effects model. A strict</w:t>
+      </w:r>
+      <w:r>
+        <w:t xml:space="preserve"> </w:t>
+      </w:r>
+      <w:r>
+        <w:rPr>
+          <w:rStyle w:val="VerbatimChar"/>
+        </w:rPr>
+        <w:t xml:space="preserve">variancePartition::dream</w:t>
+      </w:r>
+      <w:r>
+        <w:t xml:space="preserve"> </w:t>
+      </w:r>
+      <w:r>
+        <w:t xml:space="preserve">mixed-effects model with</w:t>
       </w:r>
       <w:r>
         <w:t xml:space="preserve"> </w:t>
@@ -6630,7 +5144,22 @@
         <w:t xml:space="preserve"> </w:t>
       </w:r>
       <w:r>
-        <w:t xml:space="preserve">random effect was evaluated but rejected because the Donor term cannot reduce variance for the cross-tissue comparison and artificially constrained the effective degrees of freedom (yielding only 14 vs 17 DE genes).</w:t>
+        <w:t xml:space="preserve">was rejected because the random effect could not reduce variance for the cross-tissue comparison (since donors are perfectly nested within tissue) and artificially constrained degrees of freedom. However, ignoring the paired structure entirely underpowered the within-subject activation effect. Using</w:t>
+      </w:r>
+      <w:r>
+        <w:t xml:space="preserve"> </w:t>
+      </w:r>
+      <w:r>
+        <w:rPr>
+          <w:rStyle w:val="VerbatimChar"/>
+        </w:rPr>
+        <w:t xml:space="preserve">duplicateCorrelation</w:t>
+      </w:r>
+      <w:r>
+        <w:t xml:space="preserve"> </w:t>
+      </w:r>
+      <w:r>
+        <w:t xml:space="preserve">elegantly solved this by recovering the massive statistical power of a paired design for the State effect (&gt;1,000 additional activation genes) while safely estimating the Tissue effect across all samples.</w:t>
       </w:r>
     </w:p>
     <w:bookmarkEnd w:id="25"/>

</xml_diff>